<commit_message>
Report (PDF and Word), README and final check
</commit_message>
<xml_diff>
--- a/report/Lab4_1_Report.docx
+++ b/report/Lab4_1_Report.docx
@@ -5591,10 +5591,9 @@
       </w:pPr>
       <w:r>
         <w:rPr>
-          <w:b/>
-          <w:sz w:val="20"/>
-        </w:rPr>
-        <w:t xml:space="preserve">[To be completed by the group: one or two lines that say who did which part of the work.]</w:t>
+          <w:sz w:val="20"/>
+        </w:rPr>
+        <w:t xml:space="preserve">Kirill Silchenko and Stefanos Ntentopoulos each worked through the complete lab (Parts A–D, the extra checks and the report), compared the results, and chose this version to hand in.</w:t>
       </w:r>
     </w:p>
     <w:p>

</xml_diff>

<commit_message>
Fix review findings: full top-10 table, BRB features chosen on validation, seeded logistic regressions, 1-page appendix
</commit_message>
<xml_diff>
--- a/report/Lab4_1_Report.docx
+++ b/report/Lab4_1_Report.docx
@@ -630,9 +630,9 @@
         <w:tblLayout w:type="fixed"/>
       </w:tblPr>
       <w:tblGrid>
-        <w:gridCol w:w="2426"/>
-        <w:gridCol w:w="4411"/>
-        <w:gridCol w:w="4411"/>
+        <w:gridCol w:w="2812"/>
+        <w:gridCol w:w="5113"/>
+        <w:gridCol w:w="3323"/>
       </w:tblGrid>
       <w:tr>
         <w:trPr>
@@ -640,7 +640,7 @@
         </w:trPr>
         <w:tc>
           <w:tcPr>
-            <w:tcW w:w="2426" w:type="dxa"/>
+            <w:tcW w:w="2812" w:type="dxa"/>
             <w:shd w:val="clear" w:color="auto" w:fill="E7E6E6"/>
             <w:vAlign w:val="center"/>
           </w:tcPr>
@@ -662,7 +662,7 @@
         </w:tc>
         <w:tc>
           <w:tcPr>
-            <w:tcW w:w="4411" w:type="dxa"/>
+            <w:tcW w:w="5113" w:type="dxa"/>
             <w:shd w:val="clear" w:color="auto" w:fill="E7E6E6"/>
             <w:vAlign w:val="center"/>
           </w:tcPr>
@@ -684,7 +684,7 @@
         </w:tc>
         <w:tc>
           <w:tcPr>
-            <w:tcW w:w="4411" w:type="dxa"/>
+            <w:tcW w:w="3323" w:type="dxa"/>
             <w:shd w:val="clear" w:color="auto" w:fill="E7E6E6"/>
             <w:vAlign w:val="center"/>
           </w:tcPr>
@@ -708,7 +708,7 @@
       <w:tr>
         <w:tc>
           <w:tcPr>
-            <w:tcW w:w="2426" w:type="dxa"/>
+            <w:tcW w:w="2812" w:type="dxa"/>
             <w:vAlign w:val="center"/>
           </w:tcPr>
           <w:p>
@@ -728,41 +728,41 @@
         </w:tc>
         <w:tc>
           <w:tcPr>
-            <w:tcW w:w="4411" w:type="dxa"/>
-            <w:vAlign w:val="center"/>
-          </w:tcPr>
-          <w:p>
-            <w:pPr>
-              <w:spacing w:before="20" w:after="20"/>
-              <w:rPr>
-                <w:sz w:val="17"/>
-              </w:rPr>
-            </w:pPr>
-            <w:r>
-              <w:rPr>
-                <w:sz w:val="17"/>
-              </w:rPr>
-              <w:t xml:space="preserve">decision tree (depth 3 or 4, chosen on validation), logistic regression, Random Forest (300 trees)</w:t>
-            </w:r>
-          </w:p>
-        </w:tc>
-        <w:tc>
-          <w:tcPr>
-            <w:tcW w:w="4411" w:type="dxa"/>
-            <w:vAlign w:val="center"/>
-          </w:tcPr>
-          <w:p>
-            <w:pPr>
-              <w:spacing w:before="20" w:after="20"/>
-              <w:rPr>
-                <w:sz w:val="17"/>
-              </w:rPr>
-            </w:pPr>
-            <w:r>
-              <w:rPr>
-                <w:sz w:val="17"/>
-              </w:rPr>
-              <w:t xml:space="preserve">tree rules, weights, SHAP TreeExplainer, LIME</w:t>
+            <w:tcW w:w="5113" w:type="dxa"/>
+            <w:vAlign w:val="center"/>
+          </w:tcPr>
+          <w:p>
+            <w:pPr>
+              <w:spacing w:before="20" w:after="20"/>
+              <w:rPr>
+                <w:sz w:val="17"/>
+              </w:rPr>
+            </w:pPr>
+            <w:r>
+              <w:rPr>
+                <w:sz w:val="17"/>
+              </w:rPr>
+              <w:t xml:space="preserve">tree (depth 3/4, chosen on validation), logistic regression, forest (300 trees)</w:t>
+            </w:r>
+          </w:p>
+        </w:tc>
+        <w:tc>
+          <w:tcPr>
+            <w:tcW w:w="3323" w:type="dxa"/>
+            <w:vAlign w:val="center"/>
+          </w:tcPr>
+          <w:p>
+            <w:pPr>
+              <w:spacing w:before="20" w:after="20"/>
+              <w:rPr>
+                <w:sz w:val="17"/>
+              </w:rPr>
+            </w:pPr>
+            <w:r>
+              <w:rPr>
+                <w:sz w:val="17"/>
+              </w:rPr>
+              <w:t xml:space="preserve">rules, weights, SHAP, LIME</w:t>
             </w:r>
           </w:p>
         </w:tc>
@@ -770,7 +770,7 @@
       <w:tr>
         <w:tc>
           <w:tcPr>
-            <w:tcW w:w="2426" w:type="dxa"/>
+            <w:tcW w:w="2812" w:type="dxa"/>
             <w:vAlign w:val="center"/>
           </w:tcPr>
           <w:p>
@@ -790,27 +790,27 @@
         </w:tc>
         <w:tc>
           <w:tcPr>
-            <w:tcW w:w="4411" w:type="dxa"/>
-            <w:vAlign w:val="center"/>
-          </w:tcPr>
-          <w:p>
-            <w:pPr>
-              <w:spacing w:before="20" w:after="20"/>
-              <w:rPr>
-                <w:sz w:val="17"/>
-              </w:rPr>
-            </w:pPr>
-            <w:r>
-              <w:rPr>
-                <w:sz w:val="17"/>
-              </w:rPr>
-              <w:t xml:space="preserve">forest on the 5% only (lower line); forest with 3 rounds of pseudo-labels (CUTOFF 0.9)</w:t>
-            </w:r>
-          </w:p>
-        </w:tc>
-        <w:tc>
-          <w:tcPr>
-            <w:tcW w:w="4411" w:type="dxa"/>
+            <w:tcW w:w="5113" w:type="dxa"/>
+            <w:vAlign w:val="center"/>
+          </w:tcPr>
+          <w:p>
+            <w:pPr>
+              <w:spacing w:before="20" w:after="20"/>
+              <w:rPr>
+                <w:sz w:val="17"/>
+              </w:rPr>
+            </w:pPr>
+            <w:r>
+              <w:rPr>
+                <w:sz w:val="17"/>
+              </w:rPr>
+              <w:t xml:space="preserve">forest on the 5% (lower line); forest + 3 rounds of pseudo-labels (CUTOFF 0.9)</w:t>
+            </w:r>
+          </w:p>
+        </w:tc>
+        <w:tc>
+          <w:tcPr>
+            <w:tcW w:w="3323" w:type="dxa"/>
             <w:vAlign w:val="center"/>
           </w:tcPr>
           <w:p>
@@ -832,7 +832,7 @@
       <w:tr>
         <w:tc>
           <w:tcPr>
-            <w:tcW w:w="2426" w:type="dxa"/>
+            <w:tcW w:w="2812" w:type="dxa"/>
             <w:vAlign w:val="center"/>
           </w:tcPr>
           <w:p>
@@ -852,41 +852,41 @@
         </w:tc>
         <w:tc>
           <w:tcPr>
-            <w:tcW w:w="4411" w:type="dxa"/>
-            <w:vAlign w:val="center"/>
-          </w:tcPr>
-          <w:p>
-            <w:pPr>
-              <w:spacing w:before="20" w:after="20"/>
-              <w:rPr>
-                <w:sz w:val="17"/>
-              </w:rPr>
-            </w:pPr>
-            <w:r>
-              <w:rPr>
-                <w:sz w:val="17"/>
-              </w:rPr>
-              <w:t xml:space="preserve">logistic regression on the 5% (lower line); network that fills in 20% hidden values (32 hidden units) + logistic regression on the 5%</w:t>
-            </w:r>
-          </w:p>
-        </w:tc>
-        <w:tc>
-          <w:tcPr>
-            <w:tcW w:w="4411" w:type="dxa"/>
-            <w:vAlign w:val="center"/>
-          </w:tcPr>
-          <w:p>
-            <w:pPr>
-              <w:spacing w:before="20" w:after="20"/>
-              <w:rPr>
-                <w:sz w:val="17"/>
-              </w:rPr>
-            </w:pPr>
-            <w:r>
-              <w:rPr>
-                <w:sz w:val="17"/>
-              </w:rPr>
-              <w:t xml:space="preserve">SHAP permutation explainer (seed 42)</w:t>
+            <w:tcW w:w="5113" w:type="dxa"/>
+            <w:vAlign w:val="center"/>
+          </w:tcPr>
+          <w:p>
+            <w:pPr>
+              <w:spacing w:before="20" w:after="20"/>
+              <w:rPr>
+                <w:sz w:val="17"/>
+              </w:rPr>
+            </w:pPr>
+            <w:r>
+              <w:rPr>
+                <w:sz w:val="17"/>
+              </w:rPr>
+              <w:t xml:space="preserve">logreg on the 5% (lower line); fill-in network (32 units) + logreg on the 5%</w:t>
+            </w:r>
+          </w:p>
+        </w:tc>
+        <w:tc>
+          <w:tcPr>
+            <w:tcW w:w="3323" w:type="dxa"/>
+            <w:vAlign w:val="center"/>
+          </w:tcPr>
+          <w:p>
+            <w:pPr>
+              <w:spacing w:before="20" w:after="20"/>
+              <w:rPr>
+                <w:sz w:val="17"/>
+              </w:rPr>
+            </w:pPr>
+            <w:r>
+              <w:rPr>
+                <w:sz w:val="17"/>
+              </w:rPr>
+              <w:t xml:space="preserve">SHAP permutation (seed 42)</w:t>
             </w:r>
           </w:p>
         </w:tc>
@@ -894,7 +894,7 @@
       <w:tr>
         <w:tc>
           <w:tcPr>
-            <w:tcW w:w="2426" w:type="dxa"/>
+            <w:tcW w:w="2812" w:type="dxa"/>
             <w:vAlign w:val="center"/>
           </w:tcPr>
           <w:p>
@@ -914,41 +914,41 @@
         </w:tc>
         <w:tc>
           <w:tcPr>
-            <w:tcW w:w="4411" w:type="dxa"/>
-            <w:vAlign w:val="center"/>
-          </w:tcPr>
-          <w:p>
-            <w:pPr>
-              <w:spacing w:before="20" w:after="20"/>
-              <w:rPr>
-                <w:sz w:val="17"/>
-              </w:rPr>
-            </w:pPr>
-            <w:r>
-              <w:rPr>
-                <w:sz w:val="17"/>
-              </w:rPr>
-              <w:t xml:space="preserve">BRB on the top two SHAP features, 3 × 3 = 9 rules from training data, Evidential Reasoning</w:t>
-            </w:r>
-          </w:p>
-        </w:tc>
-        <w:tc>
-          <w:tcPr>
-            <w:tcW w:w="4411" w:type="dxa"/>
-            <w:vAlign w:val="center"/>
-          </w:tcPr>
-          <w:p>
-            <w:pPr>
-              <w:spacing w:before="20" w:after="20"/>
-              <w:rPr>
-                <w:sz w:val="17"/>
-              </w:rPr>
-            </w:pPr>
-            <w:r>
-              <w:rPr>
-                <w:sz w:val="17"/>
-              </w:rPr>
-              <w:t xml:space="preserve">the rules; LIME and SHAP KernelExplainer</w:t>
+            <w:tcW w:w="5113" w:type="dxa"/>
+            <w:vAlign w:val="center"/>
+          </w:tcPr>
+          <w:p>
+            <w:pPr>
+              <w:spacing w:before="20" w:after="20"/>
+              <w:rPr>
+                <w:sz w:val="17"/>
+              </w:rPr>
+            </w:pPr>
+            <w:r>
+              <w:rPr>
+                <w:sz w:val="17"/>
+              </w:rPr>
+              <w:t xml:space="preserve">BRB on the top two SHAP features, 9 rules from training data</w:t>
+            </w:r>
+          </w:p>
+        </w:tc>
+        <w:tc>
+          <w:tcPr>
+            <w:tcW w:w="3323" w:type="dxa"/>
+            <w:vAlign w:val="center"/>
+          </w:tcPr>
+          <w:p>
+            <w:pPr>
+              <w:spacing w:before="20" w:after="20"/>
+              <w:rPr>
+                <w:sz w:val="17"/>
+              </w:rPr>
+            </w:pPr>
+            <w:r>
+              <w:rPr>
+                <w:sz w:val="17"/>
+              </w:rPr>
+              <w:t xml:space="preserve">the rules, LIME, SHAP</w:t>
             </w:r>
           </w:p>
         </w:tc>
@@ -1864,22 +1864,22 @@
           <w:i/>
           <w:sz w:val="18"/>
         </w:rPr>
-        <w:t xml:space="preserve">Table 3. The five most important features per model: tree importance, absolute logistic-regression weight, and mean |SHAP value| for the three black boxes.</w:t>
+        <w:t xml:space="preserve">Table 3. The ten most important features per model: tree importance, absolute logistic-regression weight, and mean |SHAP value| for the three black boxes.</w:t>
       </w:r>
     </w:p>
     <w:tbl>
       <w:tblPr>
         <w:tblStyle w:val="TableGrid"/>
-        <w:tblW w:w="11247" w:type="dxa"/>
+        <w:tblW w:w="11245" w:type="dxa"/>
         <w:tblLayout w:type="fixed"/>
       </w:tblPr>
       <w:tblGrid>
-        <w:gridCol w:w="362"/>
-        <w:gridCol w:w="1572"/>
-        <w:gridCol w:w="2298"/>
-        <w:gridCol w:w="2177"/>
-        <w:gridCol w:w="2419"/>
-        <w:gridCol w:w="2419"/>
+        <w:gridCol w:w="330"/>
+        <w:gridCol w:w="2205"/>
+        <w:gridCol w:w="2095"/>
+        <w:gridCol w:w="2205"/>
+        <w:gridCol w:w="2205"/>
+        <w:gridCol w:w="2205"/>
       </w:tblGrid>
       <w:tr>
         <w:trPr>
@@ -1887,7 +1887,7 @@
         </w:trPr>
         <w:tc>
           <w:tcPr>
-            <w:tcW w:w="362" w:type="dxa"/>
+            <w:tcW w:w="330" w:type="dxa"/>
             <w:shd w:val="clear" w:color="auto" w:fill="E7E6E6"/>
             <w:vAlign w:val="center"/>
           </w:tcPr>
@@ -1909,7 +1909,7 @@
         </w:tc>
         <w:tc>
           <w:tcPr>
-            <w:tcW w:w="1572" w:type="dxa"/>
+            <w:tcW w:w="2205" w:type="dxa"/>
             <w:shd w:val="clear" w:color="auto" w:fill="E7E6E6"/>
             <w:vAlign w:val="center"/>
           </w:tcPr>
@@ -1931,7 +1931,7 @@
         </w:tc>
         <w:tc>
           <w:tcPr>
-            <w:tcW w:w="2298" w:type="dxa"/>
+            <w:tcW w:w="2095" w:type="dxa"/>
             <w:shd w:val="clear" w:color="auto" w:fill="E7E6E6"/>
             <w:vAlign w:val="center"/>
           </w:tcPr>
@@ -1953,7 +1953,7 @@
         </w:tc>
         <w:tc>
           <w:tcPr>
-            <w:tcW w:w="2177" w:type="dxa"/>
+            <w:tcW w:w="2205" w:type="dxa"/>
             <w:shd w:val="clear" w:color="auto" w:fill="E7E6E6"/>
             <w:vAlign w:val="center"/>
           </w:tcPr>
@@ -1975,7 +1975,7 @@
         </w:tc>
         <w:tc>
           <w:tcPr>
-            <w:tcW w:w="2419" w:type="dxa"/>
+            <w:tcW w:w="2205" w:type="dxa"/>
             <w:shd w:val="clear" w:color="auto" w:fill="E7E6E6"/>
             <w:vAlign w:val="center"/>
           </w:tcPr>
@@ -1997,7 +1997,7 @@
         </w:tc>
         <w:tc>
           <w:tcPr>
-            <w:tcW w:w="2419" w:type="dxa"/>
+            <w:tcW w:w="2205" w:type="dxa"/>
             <w:shd w:val="clear" w:color="auto" w:fill="E7E6E6"/>
             <w:vAlign w:val="center"/>
           </w:tcPr>
@@ -2021,7 +2021,7 @@
       <w:tr>
         <w:tc>
           <w:tcPr>
-            <w:tcW w:w="362" w:type="dxa"/>
+            <w:tcW w:w="330" w:type="dxa"/>
             <w:vAlign w:val="center"/>
           </w:tcPr>
           <w:p>
@@ -2041,7 +2041,7 @@
         </w:tc>
         <w:tc>
           <w:tcPr>
-            <w:tcW w:w="1572" w:type="dxa"/>
+            <w:tcW w:w="2205" w:type="dxa"/>
             <w:vAlign w:val="center"/>
           </w:tcPr>
           <w:p>
@@ -2061,7 +2061,7 @@
         </w:tc>
         <w:tc>
           <w:tcPr>
-            <w:tcW w:w="2298" w:type="dxa"/>
+            <w:tcW w:w="2095" w:type="dxa"/>
             <w:vAlign w:val="center"/>
           </w:tcPr>
           <w:p>
@@ -2081,7 +2081,7 @@
         </w:tc>
         <w:tc>
           <w:tcPr>
-            <w:tcW w:w="2177" w:type="dxa"/>
+            <w:tcW w:w="2205" w:type="dxa"/>
             <w:vAlign w:val="center"/>
           </w:tcPr>
           <w:p>
@@ -2101,7 +2101,7 @@
         </w:tc>
         <w:tc>
           <w:tcPr>
-            <w:tcW w:w="2419" w:type="dxa"/>
+            <w:tcW w:w="2205" w:type="dxa"/>
             <w:vAlign w:val="center"/>
           </w:tcPr>
           <w:p>
@@ -2121,7 +2121,7 @@
         </w:tc>
         <w:tc>
           <w:tcPr>
-            <w:tcW w:w="2419" w:type="dxa"/>
+            <w:tcW w:w="2205" w:type="dxa"/>
             <w:vAlign w:val="center"/>
           </w:tcPr>
           <w:p>
@@ -2143,7 +2143,7 @@
       <w:tr>
         <w:tc>
           <w:tcPr>
-            <w:tcW w:w="362" w:type="dxa"/>
+            <w:tcW w:w="330" w:type="dxa"/>
             <w:vAlign w:val="center"/>
           </w:tcPr>
           <w:p>
@@ -2163,7 +2163,7 @@
         </w:tc>
         <w:tc>
           <w:tcPr>
-            <w:tcW w:w="1572" w:type="dxa"/>
+            <w:tcW w:w="2205" w:type="dxa"/>
             <w:vAlign w:val="center"/>
           </w:tcPr>
           <w:p>
@@ -2183,7 +2183,7 @@
         </w:tc>
         <w:tc>
           <w:tcPr>
-            <w:tcW w:w="2298" w:type="dxa"/>
+            <w:tcW w:w="2095" w:type="dxa"/>
             <w:vAlign w:val="center"/>
           </w:tcPr>
           <w:p>
@@ -2203,7 +2203,7 @@
         </w:tc>
         <w:tc>
           <w:tcPr>
-            <w:tcW w:w="2177" w:type="dxa"/>
+            <w:tcW w:w="2205" w:type="dxa"/>
             <w:vAlign w:val="center"/>
           </w:tcPr>
           <w:p>
@@ -2223,7 +2223,7 @@
         </w:tc>
         <w:tc>
           <w:tcPr>
-            <w:tcW w:w="2419" w:type="dxa"/>
+            <w:tcW w:w="2205" w:type="dxa"/>
             <w:vAlign w:val="center"/>
           </w:tcPr>
           <w:p>
@@ -2243,7 +2243,7 @@
         </w:tc>
         <w:tc>
           <w:tcPr>
-            <w:tcW w:w="2419" w:type="dxa"/>
+            <w:tcW w:w="2205" w:type="dxa"/>
             <w:vAlign w:val="center"/>
           </w:tcPr>
           <w:p>
@@ -2265,7 +2265,7 @@
       <w:tr>
         <w:tc>
           <w:tcPr>
-            <w:tcW w:w="362" w:type="dxa"/>
+            <w:tcW w:w="330" w:type="dxa"/>
             <w:vAlign w:val="center"/>
           </w:tcPr>
           <w:p>
@@ -2285,7 +2285,7 @@
         </w:tc>
         <w:tc>
           <w:tcPr>
-            <w:tcW w:w="1572" w:type="dxa"/>
+            <w:tcW w:w="2205" w:type="dxa"/>
             <w:vAlign w:val="center"/>
           </w:tcPr>
           <w:p>
@@ -2305,7 +2305,7 @@
         </w:tc>
         <w:tc>
           <w:tcPr>
-            <w:tcW w:w="2298" w:type="dxa"/>
+            <w:tcW w:w="2095" w:type="dxa"/>
             <w:vAlign w:val="center"/>
           </w:tcPr>
           <w:p>
@@ -2325,7 +2325,7 @@
         </w:tc>
         <w:tc>
           <w:tcPr>
-            <w:tcW w:w="2177" w:type="dxa"/>
+            <w:tcW w:w="2205" w:type="dxa"/>
             <w:vAlign w:val="center"/>
           </w:tcPr>
           <w:p>
@@ -2345,7 +2345,7 @@
         </w:tc>
         <w:tc>
           <w:tcPr>
-            <w:tcW w:w="2419" w:type="dxa"/>
+            <w:tcW w:w="2205" w:type="dxa"/>
             <w:vAlign w:val="center"/>
           </w:tcPr>
           <w:p>
@@ -2365,7 +2365,7 @@
         </w:tc>
         <w:tc>
           <w:tcPr>
-            <w:tcW w:w="2419" w:type="dxa"/>
+            <w:tcW w:w="2205" w:type="dxa"/>
             <w:vAlign w:val="center"/>
           </w:tcPr>
           <w:p>
@@ -2387,7 +2387,7 @@
       <w:tr>
         <w:tc>
           <w:tcPr>
-            <w:tcW w:w="362" w:type="dxa"/>
+            <w:tcW w:w="330" w:type="dxa"/>
             <w:vAlign w:val="center"/>
           </w:tcPr>
           <w:p>
@@ -2407,7 +2407,7 @@
         </w:tc>
         <w:tc>
           <w:tcPr>
-            <w:tcW w:w="1572" w:type="dxa"/>
+            <w:tcW w:w="2205" w:type="dxa"/>
             <w:vAlign w:val="center"/>
           </w:tcPr>
           <w:p>
@@ -2427,7 +2427,7 @@
         </w:tc>
         <w:tc>
           <w:tcPr>
-            <w:tcW w:w="2298" w:type="dxa"/>
+            <w:tcW w:w="2095" w:type="dxa"/>
             <w:vAlign w:val="center"/>
           </w:tcPr>
           <w:p>
@@ -2447,7 +2447,7 @@
         </w:tc>
         <w:tc>
           <w:tcPr>
-            <w:tcW w:w="2177" w:type="dxa"/>
+            <w:tcW w:w="2205" w:type="dxa"/>
             <w:vAlign w:val="center"/>
           </w:tcPr>
           <w:p>
@@ -2467,7 +2467,7 @@
         </w:tc>
         <w:tc>
           <w:tcPr>
-            <w:tcW w:w="2419" w:type="dxa"/>
+            <w:tcW w:w="2205" w:type="dxa"/>
             <w:vAlign w:val="center"/>
           </w:tcPr>
           <w:p>
@@ -2487,7 +2487,7 @@
         </w:tc>
         <w:tc>
           <w:tcPr>
-            <w:tcW w:w="2419" w:type="dxa"/>
+            <w:tcW w:w="2205" w:type="dxa"/>
             <w:vAlign w:val="center"/>
           </w:tcPr>
           <w:p>
@@ -2509,7 +2509,7 @@
       <w:tr>
         <w:tc>
           <w:tcPr>
-            <w:tcW w:w="362" w:type="dxa"/>
+            <w:tcW w:w="330" w:type="dxa"/>
             <w:vAlign w:val="center"/>
           </w:tcPr>
           <w:p>
@@ -2529,7 +2529,7 @@
         </w:tc>
         <w:tc>
           <w:tcPr>
-            <w:tcW w:w="1572" w:type="dxa"/>
+            <w:tcW w:w="2205" w:type="dxa"/>
             <w:vAlign w:val="center"/>
           </w:tcPr>
           <w:p>
@@ -2549,7 +2549,7 @@
         </w:tc>
         <w:tc>
           <w:tcPr>
-            <w:tcW w:w="2298" w:type="dxa"/>
+            <w:tcW w:w="2095" w:type="dxa"/>
             <w:vAlign w:val="center"/>
           </w:tcPr>
           <w:p>
@@ -2569,7 +2569,7 @@
         </w:tc>
         <w:tc>
           <w:tcPr>
-            <w:tcW w:w="2177" w:type="dxa"/>
+            <w:tcW w:w="2205" w:type="dxa"/>
             <w:vAlign w:val="center"/>
           </w:tcPr>
           <w:p>
@@ -2589,7 +2589,7 @@
         </w:tc>
         <w:tc>
           <w:tcPr>
-            <w:tcW w:w="2419" w:type="dxa"/>
+            <w:tcW w:w="2205" w:type="dxa"/>
             <w:vAlign w:val="center"/>
           </w:tcPr>
           <w:p>
@@ -2609,7 +2609,7 @@
         </w:tc>
         <w:tc>
           <w:tcPr>
-            <w:tcW w:w="2419" w:type="dxa"/>
+            <w:tcW w:w="2205" w:type="dxa"/>
             <w:vAlign w:val="center"/>
           </w:tcPr>
           <w:p>
@@ -2624,6 +2624,616 @@
                 <w:sz w:val="17"/>
               </w:rPr>
               <w:t xml:space="preserve">page_rank</w:t>
+            </w:r>
+          </w:p>
+        </w:tc>
+      </w:tr>
+      <w:tr>
+        <w:tc>
+          <w:tcPr>
+            <w:tcW w:w="330" w:type="dxa"/>
+            <w:vAlign w:val="center"/>
+          </w:tcPr>
+          <w:p>
+            <w:pPr>
+              <w:spacing w:before="20" w:after="20"/>
+              <w:rPr>
+                <w:sz w:val="17"/>
+              </w:rPr>
+            </w:pPr>
+            <w:r>
+              <w:rPr>
+                <w:sz w:val="17"/>
+              </w:rPr>
+              <w:t xml:space="preserve">6</w:t>
+            </w:r>
+          </w:p>
+        </w:tc>
+        <w:tc>
+          <w:tcPr>
+            <w:tcW w:w="2205" w:type="dxa"/>
+            <w:vAlign w:val="center"/>
+          </w:tcPr>
+          <w:p>
+            <w:pPr>
+              <w:spacing w:before="20" w:after="20"/>
+              <w:rPr>
+                <w:sz w:val="17"/>
+              </w:rPr>
+            </w:pPr>
+            <w:r>
+              <w:rPr>
+                <w:sz w:val="17"/>
+              </w:rPr>
+              <w:t xml:space="preserve">web_traffic</w:t>
+            </w:r>
+          </w:p>
+        </w:tc>
+        <w:tc>
+          <w:tcPr>
+            <w:tcW w:w="2095" w:type="dxa"/>
+            <w:vAlign w:val="center"/>
+          </w:tcPr>
+          <w:p>
+            <w:pPr>
+              <w:spacing w:before="20" w:after="20"/>
+              <w:rPr>
+                <w:sz w:val="17"/>
+              </w:rPr>
+            </w:pPr>
+            <w:r>
+              <w:rPr>
+                <w:sz w:val="17"/>
+              </w:rPr>
+              <w:t xml:space="preserve">nb_hyphens</w:t>
+            </w:r>
+          </w:p>
+        </w:tc>
+        <w:tc>
+          <w:tcPr>
+            <w:tcW w:w="2205" w:type="dxa"/>
+            <w:vAlign w:val="center"/>
+          </w:tcPr>
+          <w:p>
+            <w:pPr>
+              <w:spacing w:before="20" w:after="20"/>
+              <w:rPr>
+                <w:sz w:val="17"/>
+              </w:rPr>
+            </w:pPr>
+            <w:r>
+              <w:rPr>
+                <w:sz w:val="17"/>
+              </w:rPr>
+              <w:t xml:space="preserve">phish_hints</w:t>
+            </w:r>
+          </w:p>
+        </w:tc>
+        <w:tc>
+          <w:tcPr>
+            <w:tcW w:w="2205" w:type="dxa"/>
+            <w:vAlign w:val="center"/>
+          </w:tcPr>
+          <w:p>
+            <w:pPr>
+              <w:spacing w:before="20" w:after="20"/>
+              <w:rPr>
+                <w:sz w:val="17"/>
+              </w:rPr>
+            </w:pPr>
+            <w:r>
+              <w:rPr>
+                <w:sz w:val="17"/>
+              </w:rPr>
+              <w:t xml:space="preserve">ratio_extHyperlinks</w:t>
+            </w:r>
+          </w:p>
+        </w:tc>
+        <w:tc>
+          <w:tcPr>
+            <w:tcW w:w="2205" w:type="dxa"/>
+            <w:vAlign w:val="center"/>
+          </w:tcPr>
+          <w:p>
+            <w:pPr>
+              <w:spacing w:before="20" w:after="20"/>
+              <w:rPr>
+                <w:sz w:val="17"/>
+              </w:rPr>
+            </w:pPr>
+            <w:r>
+              <w:rPr>
+                <w:sz w:val="17"/>
+              </w:rPr>
+              <w:t xml:space="preserve">phish_hints</w:t>
+            </w:r>
+          </w:p>
+        </w:tc>
+      </w:tr>
+      <w:tr>
+        <w:tc>
+          <w:tcPr>
+            <w:tcW w:w="330" w:type="dxa"/>
+            <w:vAlign w:val="center"/>
+          </w:tcPr>
+          <w:p>
+            <w:pPr>
+              <w:spacing w:before="20" w:after="20"/>
+              <w:rPr>
+                <w:sz w:val="17"/>
+              </w:rPr>
+            </w:pPr>
+            <w:r>
+              <w:rPr>
+                <w:sz w:val="17"/>
+              </w:rPr>
+              <w:t xml:space="preserve">7</w:t>
+            </w:r>
+          </w:p>
+        </w:tc>
+        <w:tc>
+          <w:tcPr>
+            <w:tcW w:w="2205" w:type="dxa"/>
+            <w:vAlign w:val="center"/>
+          </w:tcPr>
+          <w:p>
+            <w:pPr>
+              <w:spacing w:before="20" w:after="20"/>
+              <w:rPr>
+                <w:sz w:val="17"/>
+              </w:rPr>
+            </w:pPr>
+            <w:r>
+              <w:rPr>
+                <w:sz w:val="17"/>
+              </w:rPr>
+              <w:t xml:space="preserve">phish_hints</w:t>
+            </w:r>
+          </w:p>
+        </w:tc>
+        <w:tc>
+          <w:tcPr>
+            <w:tcW w:w="2095" w:type="dxa"/>
+            <w:vAlign w:val="center"/>
+          </w:tcPr>
+          <w:p>
+            <w:pPr>
+              <w:spacing w:before="20" w:after="20"/>
+              <w:rPr>
+                <w:sz w:val="17"/>
+              </w:rPr>
+            </w:pPr>
+            <w:r>
+              <w:rPr>
+                <w:sz w:val="17"/>
+              </w:rPr>
+              <w:t xml:space="preserve">nb_www</w:t>
+            </w:r>
+          </w:p>
+        </w:tc>
+        <w:tc>
+          <w:tcPr>
+            <w:tcW w:w="2205" w:type="dxa"/>
+            <w:vAlign w:val="center"/>
+          </w:tcPr>
+          <w:p>
+            <w:pPr>
+              <w:spacing w:before="20" w:after="20"/>
+              <w:rPr>
+                <w:sz w:val="17"/>
+              </w:rPr>
+            </w:pPr>
+            <w:r>
+              <w:rPr>
+                <w:sz w:val="17"/>
+              </w:rPr>
+              <w:t xml:space="preserve">domain_age</w:t>
+            </w:r>
+          </w:p>
+        </w:tc>
+        <w:tc>
+          <w:tcPr>
+            <w:tcW w:w="2205" w:type="dxa"/>
+            <w:vAlign w:val="center"/>
+          </w:tcPr>
+          <w:p>
+            <w:pPr>
+              <w:spacing w:before="20" w:after="20"/>
+              <w:rPr>
+                <w:sz w:val="17"/>
+              </w:rPr>
+            </w:pPr>
+            <w:r>
+              <w:rPr>
+                <w:sz w:val="17"/>
+              </w:rPr>
+              <w:t xml:space="preserve">ratio_extRedirection</w:t>
+            </w:r>
+          </w:p>
+        </w:tc>
+        <w:tc>
+          <w:tcPr>
+            <w:tcW w:w="2205" w:type="dxa"/>
+            <w:vAlign w:val="center"/>
+          </w:tcPr>
+          <w:p>
+            <w:pPr>
+              <w:spacing w:before="20" w:after="20"/>
+              <w:rPr>
+                <w:sz w:val="17"/>
+              </w:rPr>
+            </w:pPr>
+            <w:r>
+              <w:rPr>
+                <w:sz w:val="17"/>
+              </w:rPr>
+              <w:t xml:space="preserve">prefix_suffix</w:t>
+            </w:r>
+          </w:p>
+        </w:tc>
+      </w:tr>
+      <w:tr>
+        <w:tc>
+          <w:tcPr>
+            <w:tcW w:w="330" w:type="dxa"/>
+            <w:vAlign w:val="center"/>
+          </w:tcPr>
+          <w:p>
+            <w:pPr>
+              <w:spacing w:before="20" w:after="20"/>
+              <w:rPr>
+                <w:sz w:val="17"/>
+              </w:rPr>
+            </w:pPr>
+            <w:r>
+              <w:rPr>
+                <w:sz w:val="17"/>
+              </w:rPr>
+              <w:t xml:space="preserve">8</w:t>
+            </w:r>
+          </w:p>
+        </w:tc>
+        <w:tc>
+          <w:tcPr>
+            <w:tcW w:w="2205" w:type="dxa"/>
+            <w:vAlign w:val="center"/>
+          </w:tcPr>
+          <w:p>
+            <w:pPr>
+              <w:spacing w:before="20" w:after="20"/>
+              <w:rPr>
+                <w:sz w:val="17"/>
+              </w:rPr>
+            </w:pPr>
+            <w:r>
+              <w:rPr>
+                <w:sz w:val="17"/>
+              </w:rPr>
+              <w:t xml:space="preserve">shortest_word_path</w:t>
+            </w:r>
+          </w:p>
+        </w:tc>
+        <w:tc>
+          <w:tcPr>
+            <w:tcW w:w="2095" w:type="dxa"/>
+            <w:vAlign w:val="center"/>
+          </w:tcPr>
+          <w:p>
+            <w:pPr>
+              <w:spacing w:before="20" w:after="20"/>
+              <w:rPr>
+                <w:sz w:val="17"/>
+              </w:rPr>
+            </w:pPr>
+            <w:r>
+              <w:rPr>
+                <w:sz w:val="17"/>
+              </w:rPr>
+              <w:t xml:space="preserve">length_hostname</w:t>
+            </w:r>
+          </w:p>
+        </w:tc>
+        <w:tc>
+          <w:tcPr>
+            <w:tcW w:w="2205" w:type="dxa"/>
+            <w:vAlign w:val="center"/>
+          </w:tcPr>
+          <w:p>
+            <w:pPr>
+              <w:spacing w:before="20" w:after="20"/>
+              <w:rPr>
+                <w:sz w:val="17"/>
+              </w:rPr>
+            </w:pPr>
+            <w:r>
+              <w:rPr>
+                <w:sz w:val="17"/>
+              </w:rPr>
+              <w:t xml:space="preserve">safe_anchor</w:t>
+            </w:r>
+          </w:p>
+        </w:tc>
+        <w:tc>
+          <w:tcPr>
+            <w:tcW w:w="2205" w:type="dxa"/>
+            <w:vAlign w:val="center"/>
+          </w:tcPr>
+          <w:p>
+            <w:pPr>
+              <w:spacing w:before="20" w:after="20"/>
+              <w:rPr>
+                <w:sz w:val="17"/>
+              </w:rPr>
+            </w:pPr>
+            <w:r>
+              <w:rPr>
+                <w:sz w:val="17"/>
+              </w:rPr>
+              <w:t xml:space="preserve">ratio_intHyperlinks</w:t>
+            </w:r>
+          </w:p>
+        </w:tc>
+        <w:tc>
+          <w:tcPr>
+            <w:tcW w:w="2205" w:type="dxa"/>
+            <w:vAlign w:val="center"/>
+          </w:tcPr>
+          <w:p>
+            <w:pPr>
+              <w:spacing w:before="20" w:after="20"/>
+              <w:rPr>
+                <w:sz w:val="17"/>
+              </w:rPr>
+            </w:pPr>
+            <w:r>
+              <w:rPr>
+                <w:sz w:val="17"/>
+              </w:rPr>
+              <w:t xml:space="preserve">avg_word_path</w:t>
+            </w:r>
+          </w:p>
+        </w:tc>
+      </w:tr>
+      <w:tr>
+        <w:tc>
+          <w:tcPr>
+            <w:tcW w:w="330" w:type="dxa"/>
+            <w:vAlign w:val="center"/>
+          </w:tcPr>
+          <w:p>
+            <w:pPr>
+              <w:spacing w:before="20" w:after="20"/>
+              <w:rPr>
+                <w:sz w:val="17"/>
+              </w:rPr>
+            </w:pPr>
+            <w:r>
+              <w:rPr>
+                <w:sz w:val="17"/>
+              </w:rPr>
+              <w:t xml:space="preserve">9</w:t>
+            </w:r>
+          </w:p>
+        </w:tc>
+        <w:tc>
+          <w:tcPr>
+            <w:tcW w:w="2205" w:type="dxa"/>
+            <w:vAlign w:val="center"/>
+          </w:tcPr>
+          <w:p>
+            <w:pPr>
+              <w:spacing w:before="20" w:after="20"/>
+              <w:rPr>
+                <w:sz w:val="17"/>
+              </w:rPr>
+            </w:pPr>
+            <w:r>
+              <w:rPr>
+                <w:sz w:val="17"/>
+              </w:rPr>
+              <w:t xml:space="preserve">domain_in_brand</w:t>
+            </w:r>
+          </w:p>
+        </w:tc>
+        <w:tc>
+          <w:tcPr>
+            <w:tcW w:w="2095" w:type="dxa"/>
+            <w:vAlign w:val="center"/>
+          </w:tcPr>
+          <w:p>
+            <w:pPr>
+              <w:spacing w:before="20" w:after="20"/>
+              <w:rPr>
+                <w:sz w:val="17"/>
+              </w:rPr>
+            </w:pPr>
+            <w:r>
+              <w:rPr>
+                <w:sz w:val="17"/>
+              </w:rPr>
+              <w:t xml:space="preserve">nb_semicolumn</w:t>
+            </w:r>
+          </w:p>
+        </w:tc>
+        <w:tc>
+          <w:tcPr>
+            <w:tcW w:w="2205" w:type="dxa"/>
+            <w:vAlign w:val="center"/>
+          </w:tcPr>
+          <w:p>
+            <w:pPr>
+              <w:spacing w:before="20" w:after="20"/>
+              <w:rPr>
+                <w:sz w:val="17"/>
+              </w:rPr>
+            </w:pPr>
+            <w:r>
+              <w:rPr>
+                <w:sz w:val="17"/>
+              </w:rPr>
+              <w:t xml:space="preserve">ratio_extHyperlinks</w:t>
+            </w:r>
+          </w:p>
+        </w:tc>
+        <w:tc>
+          <w:tcPr>
+            <w:tcW w:w="2205" w:type="dxa"/>
+            <w:vAlign w:val="center"/>
+          </w:tcPr>
+          <w:p>
+            <w:pPr>
+              <w:spacing w:before="20" w:after="20"/>
+              <w:rPr>
+                <w:sz w:val="17"/>
+              </w:rPr>
+            </w:pPr>
+            <w:r>
+              <w:rPr>
+                <w:sz w:val="17"/>
+              </w:rPr>
+              <w:t xml:space="preserve">char_repeat</w:t>
+            </w:r>
+          </w:p>
+        </w:tc>
+        <w:tc>
+          <w:tcPr>
+            <w:tcW w:w="2205" w:type="dxa"/>
+            <w:vAlign w:val="center"/>
+          </w:tcPr>
+          <w:p>
+            <w:pPr>
+              <w:spacing w:before="20" w:after="20"/>
+              <w:rPr>
+                <w:sz w:val="17"/>
+              </w:rPr>
+            </w:pPr>
+            <w:r>
+              <w:rPr>
+                <w:sz w:val="17"/>
+              </w:rPr>
+              <w:t xml:space="preserve">shortening_service</w:t>
+            </w:r>
+          </w:p>
+        </w:tc>
+      </w:tr>
+      <w:tr>
+        <w:tc>
+          <w:tcPr>
+            <w:tcW w:w="330" w:type="dxa"/>
+            <w:vAlign w:val="center"/>
+          </w:tcPr>
+          <w:p>
+            <w:pPr>
+              <w:spacing w:before="20" w:after="20"/>
+              <w:rPr>
+                <w:sz w:val="17"/>
+              </w:rPr>
+            </w:pPr>
+            <w:r>
+              <w:rPr>
+                <w:sz w:val="17"/>
+              </w:rPr>
+              <w:t xml:space="preserve">10</w:t>
+            </w:r>
+          </w:p>
+        </w:tc>
+        <w:tc>
+          <w:tcPr>
+            <w:tcW w:w="2205" w:type="dxa"/>
+            <w:vAlign w:val="center"/>
+          </w:tcPr>
+          <w:p>
+            <w:pPr>
+              <w:spacing w:before="20" w:after="20"/>
+              <w:rPr>
+                <w:sz w:val="17"/>
+              </w:rPr>
+            </w:pPr>
+            <w:r>
+              <w:rPr>
+                <w:sz w:val="17"/>
+              </w:rPr>
+              <w:t xml:space="preserve">ratio_extRedirection</w:t>
+            </w:r>
+          </w:p>
+        </w:tc>
+        <w:tc>
+          <w:tcPr>
+            <w:tcW w:w="2095" w:type="dxa"/>
+            <w:vAlign w:val="center"/>
+          </w:tcPr>
+          <w:p>
+            <w:pPr>
+              <w:spacing w:before="20" w:after="20"/>
+              <w:rPr>
+                <w:sz w:val="17"/>
+              </w:rPr>
+            </w:pPr>
+            <w:r>
+              <w:rPr>
+                <w:sz w:val="17"/>
+              </w:rPr>
+              <w:t xml:space="preserve">nb_hyperlinks</w:t>
+            </w:r>
+          </w:p>
+        </w:tc>
+        <w:tc>
+          <w:tcPr>
+            <w:tcW w:w="2205" w:type="dxa"/>
+            <w:vAlign w:val="center"/>
+          </w:tcPr>
+          <w:p>
+            <w:pPr>
+              <w:spacing w:before="20" w:after="20"/>
+              <w:rPr>
+                <w:sz w:val="17"/>
+              </w:rPr>
+            </w:pPr>
+            <w:r>
+              <w:rPr>
+                <w:sz w:val="17"/>
+              </w:rPr>
+              <w:t xml:space="preserve">ratio_extRedirection</w:t>
+            </w:r>
+          </w:p>
+        </w:tc>
+        <w:tc>
+          <w:tcPr>
+            <w:tcW w:w="2205" w:type="dxa"/>
+            <w:vAlign w:val="center"/>
+          </w:tcPr>
+          <w:p>
+            <w:pPr>
+              <w:spacing w:before="20" w:after="20"/>
+              <w:rPr>
+                <w:sz w:val="17"/>
+              </w:rPr>
+            </w:pPr>
+            <w:r>
+              <w:rPr>
+                <w:sz w:val="17"/>
+              </w:rPr>
+              <w:t xml:space="preserve">safe_anchor</w:t>
+            </w:r>
+          </w:p>
+        </w:tc>
+        <w:tc>
+          <w:tcPr>
+            <w:tcW w:w="2205" w:type="dxa"/>
+            <w:vAlign w:val="center"/>
+          </w:tcPr>
+          <w:p>
+            <w:pPr>
+              <w:spacing w:before="20" w:after="20"/>
+              <w:rPr>
+                <w:sz w:val="17"/>
+              </w:rPr>
+            </w:pPr>
+            <w:r>
+              <w:rPr>
+                <w:sz w:val="17"/>
+              </w:rPr>
+              <w:t xml:space="preserve">domain_in_title</w:t>
             </w:r>
           </w:p>
         </w:tc>
@@ -3048,7 +3658,7 @@
         <w:rPr>
           <w:sz w:val="20"/>
         </w:rPr>
-        <w:t xml:space="preserve"> (how many links the page has). Ranking the features on 500 validation URLs instead of test URLs gives the same top 10 in the same order, so this choice does not leak test information. Referential values are the 5th percentile, median and 95th percentile of the training data (</w:t>
+        <w:t xml:space="preserve"> (how many links the page has). To keep the test set for scoring only, this ranking is computed with SHAP on 500 validation URLs; on the test URLs it is the same top 10 in the same order. Referential values are the 5th percentile, median and 95th percentile of the training data (</w:t>
       </w:r>
       <w:r>
         <w:rPr>
@@ -5201,7 +5811,7 @@
         <w:rPr>
           <w:sz w:val="20"/>
         </w:rPr>
-        <w:t xml:space="preserve"> are in all five top-10 lists (Table 3 shows the top 5), and </w:t>
+        <w:t xml:space="preserve"> are in all five top-10 lists (Table 3), and </w:t>
       </w:r>
       <w:r>
         <w:rPr>
@@ -5753,7 +6363,7 @@
         <w:rPr>
           <w:sz w:val="20"/>
         </w:rPr>
-        <w:t xml:space="preserve"> runs from top to bottom and writes every number and figure in this report. Below (Figures 2 and 3): two of its cells, the pseudo-labelling with the check of the guesses against the hidden labels (step A8), and the referential values and data-driven rules of the BRB (step D3).</w:t>
+        <w:t xml:space="preserve"> runs from top to bottom and writes every number and figure in this report. Below (Figures 2 and 3): excerpts of two of its cells, the pseudo-labelling with the check of the guesses against the hidden labels (step A8), and the referential values and data-driven rules of the BRB (step D3).</w:t>
       </w:r>
     </w:p>
     <w:p>
@@ -5765,7 +6375,7 @@
       <w:r>
         <w:drawing>
           <wp:inline distT="0" distB="0" distL="0" distR="0">
-            <wp:extent cx="6766560" cy="5975718"/>
+            <wp:extent cx="6766560" cy="4220888"/>
             <wp:docPr id="102" name="Picture 102"/>
             <a:graphic xmlns:a="http://schemas.openxmlformats.org/drawingml/2006/main">
               <a:graphicData uri="http://schemas.openxmlformats.org/drawingml/2006/picture">
@@ -5783,7 +6393,7 @@
                   <pic:spPr>
                     <a:xfrm>
                       <a:off x="0" y="0"/>
-                      <a:ext cx="6766560" cy="5975718"/>
+                      <a:ext cx="6766560" cy="4220888"/>
                     </a:xfrm>
                     <a:prstGeom prst="rect">
                       <a:avLst/>
@@ -5808,7 +6418,7 @@
           <w:i/>
           <w:sz w:val="18"/>
         </w:rPr>
-        <w:t xml:space="preserve">Figure 2. Step A8: pseudo-labelling; the hidden labels are only used to count correct guesses.</w:t>
+        <w:t xml:space="preserve">Figure 2. Step A8, first 27 lines: pseudo-labelling; the hidden labels are only used to count correct guesses.</w:t>
       </w:r>
     </w:p>
     <w:p>
@@ -5820,7 +6430,7 @@
       <w:r>
         <w:drawing>
           <wp:inline distT="0" distB="0" distL="0" distR="0">
-            <wp:extent cx="6269659" cy="7772400"/>
+            <wp:extent cx="6766560" cy="3789766"/>
             <wp:docPr id="103" name="Picture 103"/>
             <a:graphic xmlns:a="http://schemas.openxmlformats.org/drawingml/2006/main">
               <a:graphicData uri="http://schemas.openxmlformats.org/drawingml/2006/picture">
@@ -5838,7 +6448,7 @@
                   <pic:spPr>
                     <a:xfrm>
                       <a:off x="0" y="0"/>
-                      <a:ext cx="6269659" cy="7772400"/>
+                      <a:ext cx="6766560" cy="3789766"/>
                     </a:xfrm>
                     <a:prstGeom prst="rect">
                       <a:avLst/>
@@ -5863,7 +6473,7 @@
           <w:i/>
           <w:sz w:val="18"/>
         </w:rPr>
-        <w:t xml:space="preserve">Figure 3. Step D3: referential values from the training data and the nine rules.</w:t>
+        <w:t xml:space="preserve">Figure 3. Step D3, first 24 lines: referential values from the training data and the nine rules.</w:t>
       </w:r>
     </w:p>
     <w:sectPr>

</xml_diff>